<commit_message>
ISO W10 audit pointer retroaktif: FAT-SOP-01 (rujukan butir 4.8 dikembalikan di dua langkah TOP)
Co-Authored-By: Claude Opus 5.5 <noreply@anthropic.com>
Claude-Session: https://claude.ai/code/session_01BhkCQM7h3krZb9kjY2Nate
</commit_message>
<xml_diff>
--- a/out/03_FAT/SNX-FAT-SOP-01 Billing & Invoicing (Rev00 DRAFT).docx
+++ b/out/03_FAT/SNX-FAT-SOP-01 Billing & Invoicing (Rev00 DRAFT).docx
@@ -6392,7 +6392,7 @@
                 <w:sz w:val="24"/>
                 <w:szCs w:val="24"/>
               </w:rPr>
-              <w:t>3. Susun draf invoice di Templat Invoice Resmi FAT (Google Sheets), berisi nomor invoice, tanggal penerbitan, rincian pekerjaan, nominal PPN, estimasi PPh Pasal 23, dan jatuh tempo sesuai TOP.</w:t>
+              <w:t>3. Susun draf invoice di Templat Invoice Resmi FAT (Google Sheets), berisi nomor invoice, tanggal penerbitan, rincian pekerjaan, nominal PPN, estimasi PPh Pasal 23, dan jatuh tempo sesuai TOP (butir 4.8).</w:t>
             </w:r>
           </w:p>
         </w:tc>
@@ -6818,7 +6818,7 @@
                 <w:sz w:val="24"/>
                 <w:szCs w:val="24"/>
               </w:rPr>
-              <w:t>3. Teruskan draf invoice ke Direktur Utama jika TOP di atas TOP standar.</w:t>
+              <w:t>3. Teruskan draf invoice ke Direktur Utama jika TOP di atas TOP standar (butir 4.8).</w:t>
             </w:r>
           </w:p>
         </w:tc>

</xml_diff>